<commit_message>
fix(rbpp-pipeline): corrige la veille HAS du 31/08 — trois projections sans page retirées, clôtures liées ou datées par leur édition, calendrier de la note de cadrage, article des 22 ans et flux RSS liés (7 — 6 ✅ / 1 ⚠️) ; journal du 21/09 dans le .docx et le .md
Co-Authored-By: Claude Opus 5 <noreply@anthropic.com>
</commit_message>
<xml_diff>
--- a/sources/veille/2026-08-31_veille_has-actualite.docx
+++ b/sources/veille/2026-08-31_veille_has-actualite.docx
@@ -90,7 +90,39 @@
           <w:sz w:val="22"/>
           <w:szCs w:val="22"/>
         </w:rPr>
-        <w:t xml:space="preserve">Aucune nouvelle RBPP publiée dans la fenêtre de référence — semaine de rentrée encore creuse sur has-sante.fr.</w:t>
+        <w:t xml:space="preserve">Aucune nouvelle RBPP publiée dans la fenêtre de référence — semaine de rentrée encore creuse sur has-sante.fr ; confirmé à la relecture du 21/09/2026 sur le flux RSS « Recommandations et guides » de la HAS (</w:t>
+      </w:r>
+      <w:hyperlink w:history="1" r:id="rIdC31rss">
+        <w:r>
+          <w:rPr>
+            <w:rFonts w:ascii="Calibri" w:cs="Calibri" w:eastAsia="Calibri" w:hAnsi="Calibri"/>
+            <w:color w:val="1155CC"/>
+            <w:sz w:val="22"/>
+            <w:szCs w:val="22"/>
+            <w:u w:val="single"/>
+          </w:rPr>
+          <w:t xml:space="preserve">has-sante.fr/feed/Rss2.jsp?id=p_3081452</w:t>
+        </w:r>
+      </w:hyperlink>
+      <w:r>
+        <w:rPr>
+          <w:rFonts w:ascii="Calibri" w:cs="Calibri" w:eastAsia="Calibri" w:hAnsi="Calibri"/>
+          <w:color w:val="1F2937"/>
+          <w:sz w:val="22"/>
+          <w:szCs w:val="22"/>
+        </w:rPr>
+        <w:t xml:space="preserve">) : aucune entrée du secteur datée du 24 au 31 août. </w:t>
+      </w:r>
+      <w:r>
+        <w:rPr>
+          <w:rFonts w:ascii="Calibri" w:cs="Calibri" w:eastAsia="Calibri" w:hAnsi="Calibri"/>
+          <w:i/>
+          <w:iCs/>
+          <w:color w:val="6B7280"/>
+          <w:sz w:val="20"/>
+          <w:szCs w:val="20"/>
+        </w:rPr>
+        <w:t xml:space="preserve">[Corrigé le 21/09/2026 : constat sans source lisible ; le flux, lisible en headless, le confirme.]</w:t>
       </w:r>
     </w:p>
     <w:p>
@@ -290,16 +322,42 @@
     </w:p>
     <w:p>
       <w:pPr>
-        <w:spacing w:after="60"/>
-      </w:pPr>
-      <w:r>
-        <w:rPr>
-          <w:rFonts w:ascii="Calibri" w:cs="Calibri" w:eastAsia="Calibri" w:hAnsi="Calibri"/>
-          <w:color w:val="1F2937"/>
-          <w:sz w:val="22"/>
-          <w:szCs w:val="22"/>
-        </w:rPr>
-        <w:t xml:space="preserve">HAS — 22 ans d'existence (article du 13 août 2026) : la HAS publie une frise interactive retraçant ses évolutions, incluant l'extension à l'évaluation des ESSMS.</w:t>
+        <w:pStyle w:val="ListParagraph"/>
+        <w:numPr>
+          <w:ilvl w:val="0"/>
+          <w:numId w:val="1"/>
+        </w:numPr>
+        <w:spacing w:after="50"/>
+      </w:pPr>
+      <w:r>
+        <w:rPr>
+          <w:rFonts w:ascii="Calibri" w:cs="Calibri" w:eastAsia="Calibri" w:hAnsi="Calibri"/>
+          <w:color w:val="1F2937"/>
+          <w:sz w:val="22"/>
+          <w:szCs w:val="22"/>
+        </w:rPr>
+        <w:t xml:space="preserve">HAS — 22 ans d'existence (</w:t>
+      </w:r>
+      <w:hyperlink w:history="1" r:id="rIdC31ans">
+        <w:r>
+          <w:rPr>
+            <w:rFonts w:ascii="Calibri" w:cs="Calibri" w:eastAsia="Calibri" w:hAnsi="Calibri"/>
+            <w:color w:val="1155CC"/>
+            <w:sz w:val="22"/>
+            <w:szCs w:val="22"/>
+            <w:u w:val="single"/>
+          </w:rPr>
+          <w:t xml:space="preserve">article du 13 août 2026</w:t>
+        </w:r>
+      </w:hyperlink>
+      <w:r>
+        <w:rPr>
+          <w:rFonts w:ascii="Calibri" w:cs="Calibri" w:eastAsia="Calibri" w:hAnsi="Calibri"/>
+          <w:color w:val="1F2937"/>
+          <w:sz w:val="22"/>
+          <w:szCs w:val="22"/>
+        </w:rPr>
+        <w:t xml:space="preserve">) : la HAS publie une frise interactive retraçant ses évolutions, incluant l'extension à l'évaluation des ESSMS.</w:t>
       </w:r>
     </w:p>
     <w:p>
@@ -348,64 +406,139 @@
           <w:sz w:val="22"/>
           <w:szCs w:val="22"/>
         </w:rPr>
-        <w:t xml:space="preserve">RBPP « Vie quotidienne des enfants de 3 à 11 ans accueillis dans les établissements de protection de l'enfance » : appel à candidatures clos le 4 septembre 2026. Sélection des experts en septembre, travaux démarrant à l'automne 2026.</w:t>
-      </w:r>
-    </w:p>
-    <w:p>
-      <w:pPr>
-        <w:pStyle w:val="ListParagraph"/>
-        <w:numPr>
-          <w:ilvl w:val="0"/>
-          <w:numId w:val="1"/>
-        </w:numPr>
-        <w:spacing w:after="50"/>
-      </w:pPr>
-      <w:r>
-        <w:rPr>
-          <w:rFonts w:ascii="Calibri" w:cs="Calibri" w:eastAsia="Calibri" w:hAnsi="Calibri"/>
-          <w:color w:val="1F2937"/>
-          <w:sz w:val="22"/>
-          <w:szCs w:val="22"/>
-        </w:rPr>
-        <w:t xml:space="preserve">RBPP « Prévention spécialisée : accompagner les jeunes sur leurs territoires et dans leurs milieux de vie » : groupe de travail actif jusqu'en septembre 2026 — publication de la recommandation attendue en fin d'année.</w:t>
-      </w:r>
-    </w:p>
-    <w:p>
-      <w:pPr>
-        <w:pStyle w:val="ListParagraph"/>
-        <w:numPr>
-          <w:ilvl w:val="0"/>
-          <w:numId w:val="1"/>
-        </w:numPr>
-        <w:spacing w:after="50"/>
-      </w:pPr>
-      <w:r>
-        <w:rPr>
-          <w:rFonts w:ascii="Calibri" w:cs="Calibri" w:eastAsia="Calibri" w:hAnsi="Calibri"/>
-          <w:color w:val="1F2937"/>
-          <w:sz w:val="22"/>
-          <w:szCs w:val="22"/>
-        </w:rPr>
-        <w:t xml:space="preserve">RBPP « Accompagnement au développement de l'autodétermination et du pouvoir d'agir des personnes en ESSMS » : travaux en cours, publication initialement prévue en 2026.</w:t>
-      </w:r>
-    </w:p>
-    <w:p>
-      <w:pPr>
-        <w:pStyle w:val="ListParagraph"/>
-        <w:numPr>
-          <w:ilvl w:val="0"/>
-          <w:numId w:val="1"/>
-        </w:numPr>
-        <w:spacing w:after="50"/>
-      </w:pPr>
-      <w:r>
-        <w:rPr>
-          <w:rFonts w:ascii="Calibri" w:cs="Calibri" w:eastAsia="Calibri" w:hAnsi="Calibri"/>
-          <w:color w:val="1F2937"/>
-          <w:sz w:val="22"/>
-          <w:szCs w:val="22"/>
-        </w:rPr>
-        <w:t xml:space="preserve">RBPP Habitat — volet 3 : travaux en cours (appel candidatures clôturé en avril 2026), publication attendue.</w:t>
+        <w:t xml:space="preserve">RBPP « Vie quotidienne des enfants de 3 à 11 ans accueillis dans les établissements de protection de l'enfance » : appel à candidatures clos le 4 septembre 2026 (</w:t>
+      </w:r>
+      <w:hyperlink w:history="1" r:id="rIdryodq4315m9enktzusela">
+        <w:r>
+          <w:rPr>
+            <w:rFonts w:ascii="Calibri" w:cs="Calibri" w:eastAsia="Calibri" w:hAnsi="Calibri"/>
+            <w:color w:val="1155CC"/>
+            <w:sz w:val="22"/>
+            <w:szCs w:val="22"/>
+            <w:u w:val="single"/>
+          </w:rPr>
+          <w:t xml:space="preserve">page de l'appel, ouverte le 31/08/2026</w:t>
+        </w:r>
+      </w:hyperlink>
+      <w:r>
+        <w:rPr>
+          <w:rFonts w:ascii="Calibri" w:cs="Calibri" w:eastAsia="Calibri" w:hAnsi="Calibri"/>
+          <w:color w:val="1F2937"/>
+          <w:sz w:val="22"/>
+          <w:szCs w:val="22"/>
+        </w:rPr>
+        <w:t xml:space="preserve"> ; derrière une identification depuis le 14/09/2026). Composition des groupes 09-10/2026, travaux à partir de 11/2026, passage en commission au 4e trimestre 2027 selon la </w:t>
+      </w:r>
+      <w:hyperlink w:history="1" r:id="rIdC31cad">
+        <w:r>
+          <w:rPr>
+            <w:rFonts w:ascii="Calibri" w:cs="Calibri" w:eastAsia="Calibri" w:hAnsi="Calibri"/>
+            <w:color w:val="1155CC"/>
+            <w:sz w:val="22"/>
+            <w:szCs w:val="22"/>
+            <w:u w:val="single"/>
+          </w:rPr>
+          <w:t xml:space="preserve">note de cadrage validée le 07/07/2026</w:t>
+        </w:r>
+      </w:hyperlink>
+      <w:r>
+        <w:rPr>
+          <w:rFonts w:ascii="Calibri" w:cs="Calibri" w:eastAsia="Calibri" w:hAnsi="Calibri"/>
+          <w:color w:val="1F2937"/>
+          <w:sz w:val="22"/>
+          <w:szCs w:val="22"/>
+        </w:rPr>
+        <w:t xml:space="preserve">. </w:t>
+      </w:r>
+      <w:r>
+        <w:rPr>
+          <w:rFonts w:ascii="Calibri" w:cs="Calibri" w:eastAsia="Calibri" w:hAnsi="Calibri"/>
+          <w:i/>
+          <w:iCs/>
+          <w:color w:val="6B7280"/>
+          <w:sz w:val="20"/>
+          <w:szCs w:val="20"/>
+        </w:rPr>
+        <w:t xml:space="preserve">[Corrigé le 21/09/2026 : la date de clôture était écrite sans lien dans la phrase ; « sélection des experts en septembre, travaux démarrant à l'automne 2026 » remplacé par le calendrier de la note de cadrage, qui était publique depuis le 09/07/2026.]</w:t>
+      </w:r>
+    </w:p>
+    <w:p>
+      <w:pPr>
+        <w:pStyle w:val="ListParagraph"/>
+        <w:numPr>
+          <w:ilvl w:val="0"/>
+          <w:numId w:val="1"/>
+        </w:numPr>
+        <w:spacing w:after="50"/>
+      </w:pPr>
+      <w:r>
+        <w:rPr>
+          <w:rFonts w:ascii="Calibri" w:cs="Calibri" w:eastAsia="Calibri" w:hAnsi="Calibri"/>
+          <w:color w:val="1F2937"/>
+          <w:sz w:val="22"/>
+          <w:szCs w:val="22"/>
+        </w:rPr>
+        <w:t xml:space="preserve">RBPP « Prévention spécialisée : accompagner les jeunes sur leurs territoires et dans leurs milieux de vie » : groupe de travail actif jusqu'en septembre 2026 — 8 séances de juin 2025 à septembre 2026 d'après l'édition du 02/09/2026 de cette veille, page alors ouverte ; aucune date de publication annoncée. </w:t>
+      </w:r>
+      <w:r>
+        <w:rPr>
+          <w:rFonts w:ascii="Calibri" w:cs="Calibri" w:eastAsia="Calibri" w:hAnsi="Calibri"/>
+          <w:i/>
+          <w:iCs/>
+          <w:color w:val="6B7280"/>
+          <w:sz w:val="20"/>
+          <w:szCs w:val="20"/>
+        </w:rPr>
+        <w:t xml:space="preserve">[Corrigé le 21/09/2026 : « publication de la recommandation attendue en fin d'année » était une projection sans page.]</w:t>
+      </w:r>
+    </w:p>
+    <w:p>
+      <w:pPr>
+        <w:pStyle w:val="ListParagraph"/>
+        <w:numPr>
+          <w:ilvl w:val="0"/>
+          <w:numId w:val="1"/>
+        </w:numPr>
+        <w:spacing w:after="50"/>
+      </w:pPr>
+      <w:r>
+        <w:rPr>
+          <w:rFonts w:ascii="Calibri" w:cs="Calibri" w:eastAsia="Calibri" w:hAnsi="Calibri"/>
+          <w:color w:val="1F2937"/>
+          <w:sz w:val="22"/>
+          <w:szCs w:val="22"/>
+        </w:rPr>
+        <w:t xml:space="preserve">RBPP « Accompagnement au développement de l'autodétermination et du pouvoir d'agir des personnes en ESSMS » : travaux en cours, publication initialement prévue en 2026 d'après la page du groupe de travail (ouverte le 31/08/2026, derrière une identification au 21/09/2026).</w:t>
+      </w:r>
+    </w:p>
+    <w:p>
+      <w:pPr>
+        <w:pStyle w:val="ListParagraph"/>
+        <w:numPr>
+          <w:ilvl w:val="0"/>
+          <w:numId w:val="1"/>
+        </w:numPr>
+        <w:spacing w:after="50"/>
+      </w:pPr>
+      <w:r>
+        <w:rPr>
+          <w:rFonts w:ascii="Calibri" w:cs="Calibri" w:eastAsia="Calibri" w:hAnsi="Calibri"/>
+          <w:color w:val="1F2937"/>
+          <w:sz w:val="22"/>
+          <w:szCs w:val="22"/>
+        </w:rPr>
+        <w:t xml:space="preserve">RBPP Habitat — volet 3 : travaux en cours ; appel à candidatures clos le 3 avril 2026 d'après l'édition du 02/09/2026 de cette veille, page alors ouverte ; aucune date de publication annoncée. </w:t>
+      </w:r>
+      <w:r>
+        <w:rPr>
+          <w:rFonts w:ascii="Calibri" w:cs="Calibri" w:eastAsia="Calibri" w:hAnsi="Calibri"/>
+          <w:i/>
+          <w:iCs/>
+          <w:color w:val="6B7280"/>
+          <w:sz w:val="20"/>
+          <w:szCs w:val="20"/>
+        </w:rPr>
+        <w:t xml:space="preserve">[Corrigé le 21/09/2026 : « appel candidatures clôturé en avril 2026 », sans jour ni source, et « publication attendue », sans page.]</w:t>
       </w:r>
     </w:p>
     <w:p>
@@ -454,7 +587,28 @@
           <w:sz w:val="22"/>
           <w:szCs w:val="22"/>
         </w:rPr>
-        <w:t xml:space="preserve">Appel à candidatures — RBPP vie quotidienne enfants 3-11 ans (protection de l'enfance) : clôture le 4 septembre 2026. Lien : has-sante.fr (voir sources).</w:t>
+        <w:t xml:space="preserve">Appel à candidatures — RBPP vie quotidienne enfants 3-11 ans (protection de l'enfance) : clôture le 4 septembre 2026 (</w:t>
+      </w:r>
+      <w:hyperlink w:history="1" r:id="rIdryodq4315m9enktzusela">
+        <w:r>
+          <w:rPr>
+            <w:rFonts w:ascii="Calibri" w:cs="Calibri" w:eastAsia="Calibri" w:hAnsi="Calibri"/>
+            <w:color w:val="1155CC"/>
+            <w:sz w:val="22"/>
+            <w:szCs w:val="22"/>
+            <w:u w:val="single"/>
+          </w:rPr>
+          <w:t xml:space="preserve">page de l'appel</w:t>
+        </w:r>
+      </w:hyperlink>
+      <w:r>
+        <w:rPr>
+          <w:rFonts w:ascii="Calibri" w:cs="Calibri" w:eastAsia="Calibri" w:hAnsi="Calibri"/>
+          <w:color w:val="1F2937"/>
+          <w:sz w:val="22"/>
+          <w:szCs w:val="22"/>
+        </w:rPr>
+        <w:t xml:space="preserve">).</w:t>
       </w:r>
     </w:p>
     <w:p>
@@ -560,7 +714,18 @@
           <w:sz w:val="22"/>
           <w:szCs w:val="22"/>
         </w:rPr>
-        <w:t xml:space="preserve">RENTRÉE SEPTEMBRE 2026 : publication probable de la RBPP Prévention spécialisée — à surveiller pour son impact éventuel sur les pratiques de travail social.</w:t>
+        <w:t xml:space="preserve">RENTRÉE SEPTEMBRE 2026 : dernière séance du groupe de travail de la RBPP Prévention spécialisée prévue en septembre 2026 (calendrier de l'édition du 02/09/2026) ; aucune date de publication annoncée — à surveiller pour son impact éventuel sur les pratiques de travail social. </w:t>
+      </w:r>
+      <w:r>
+        <w:rPr>
+          <w:rFonts w:ascii="Calibri" w:cs="Calibri" w:eastAsia="Calibri" w:hAnsi="Calibri"/>
+          <w:i/>
+          <w:iCs/>
+          <w:color w:val="6B7280"/>
+          <w:sz w:val="20"/>
+          <w:szCs w:val="20"/>
+        </w:rPr>
+        <w:t xml:space="preserve">[Corrigé le 21/09/2026 : « publication probable de la RBPP Prévention spécialisée » était une projection.]</w:t>
       </w:r>
     </w:p>
     <w:p>
@@ -623,7 +788,7 @@
           <w:sz w:val="22"/>
           <w:szCs w:val="22"/>
         </w:rPr>
-        <w:t xml:space="preserve">Bilan : 5 sources documentaires tentées — 4 ✅ consultées et mobilisées / 1 ⚠️ identifiée via extraits de recherche uniquement.</w:t>
+        <w:t xml:space="preserve">Bilan : 7 sources documentaires tentées — 6 ✅ consultées et mobilisées / 1 ⚠️ identifiée via extraits de recherche uniquement.</w:t>
       </w:r>
     </w:p>
     <w:p>
@@ -780,6 +945,68 @@
           <w:sz w:val="22"/>
           <w:szCs w:val="22"/>
         </w:rPr>
+        <w:t xml:space="preserve">✅ </w:t>
+      </w:r>
+      <w:hyperlink w:history="1" r:id="rIdC31rss">
+        <w:r>
+          <w:rPr>
+            <w:rFonts w:ascii="Calibri" w:cs="Calibri" w:eastAsia="Calibri" w:hAnsi="Calibri"/>
+            <w:color w:val="1155CC"/>
+            <w:sz w:val="22"/>
+            <w:szCs w:val="22"/>
+            <w:u w:val="single"/>
+          </w:rPr>
+          <w:t xml:space="preserve">HAS — flux RSS « Recommandations et guides » (lu le 21/09/2026 à la relecture)</w:t>
+        </w:r>
+      </w:hyperlink>
+    </w:p>
+    <w:p>
+      <w:pPr>
+        <w:pStyle w:val="ListParagraph"/>
+        <w:numPr>
+          <w:ilvl w:val="0"/>
+          <w:numId w:val="1"/>
+        </w:numPr>
+        <w:spacing w:after="50"/>
+      </w:pPr>
+      <w:r>
+        <w:rPr>
+          <w:rFonts w:ascii="Calibri" w:cs="Calibri" w:eastAsia="Calibri" w:hAnsi="Calibri"/>
+          <w:color w:val="1F2937"/>
+          <w:sz w:val="22"/>
+          <w:szCs w:val="22"/>
+        </w:rPr>
+        <w:t xml:space="preserve">✅ </w:t>
+      </w:r>
+      <w:hyperlink w:history="1" r:id="rIdC31ans">
+        <w:r>
+          <w:rPr>
+            <w:rFonts w:ascii="Calibri" w:cs="Calibri" w:eastAsia="Calibri" w:hAnsi="Calibri"/>
+            <w:color w:val="1155CC"/>
+            <w:sz w:val="22"/>
+            <w:szCs w:val="22"/>
+            <w:u w:val="single"/>
+          </w:rPr>
+          <w:t xml:space="preserve">HAS — La HAS fête ses 22 ans (article du 13/08/2026) [lien ajouté à la relecture du 21/09/2026]</w:t>
+        </w:r>
+      </w:hyperlink>
+    </w:p>
+    <w:p>
+      <w:pPr>
+        <w:pStyle w:val="ListParagraph"/>
+        <w:numPr>
+          <w:ilvl w:val="0"/>
+          <w:numId w:val="1"/>
+        </w:numPr>
+        <w:spacing w:after="50"/>
+      </w:pPr>
+      <w:r>
+        <w:rPr>
+          <w:rFonts w:ascii="Calibri" w:cs="Calibri" w:eastAsia="Calibri" w:hAnsi="Calibri"/>
+          <w:color w:val="1F2937"/>
+          <w:sz w:val="22"/>
+          <w:szCs w:val="22"/>
+        </w:rPr>
         <w:t xml:space="preserve">⚠️ </w:t>
       </w:r>
       <w:hyperlink w:history="1" r:id="rIdgkp0mkah33hulcyk2yf7k">
@@ -829,6 +1056,206 @@
           <w:szCs w:val="22"/>
         </w:rPr>
         <w:t xml:space="preserve">Note générée automatiquement le 31/08/2026 — Pipeline RBPP / Veille HAS hebdomadaire</w:t>
+      </w:r>
+    </w:p>
+    <w:p>
+      <w:pPr>
+        <w:spacing w:after="120" w:before="320"/>
+      </w:pPr>
+      <w:r>
+        <w:rPr>
+          <w:rFonts w:ascii="Calibri" w:cs="Calibri" w:eastAsia="Calibri" w:hAnsi="Calibri"/>
+          <w:b/>
+          <w:bCs/>
+          <w:color w:val="1B3A6B"/>
+          <w:sz w:val="28"/>
+          <w:szCs w:val="28"/>
+        </w:rPr>
+        <w:t xml:space="preserve">📝 Journal des corrections — 21 septembre 2026</w:t>
+      </w:r>
+    </w:p>
+    <w:p>
+      <w:pPr>
+        <w:spacing w:after="60"/>
+      </w:pPr>
+      <w:r>
+        <w:rPr>
+          <w:rFonts w:ascii="Calibri" w:cs="Calibri" w:eastAsia="Calibri" w:hAnsi="Calibri"/>
+          <w:i/>
+          <w:iCs/>
+          <w:color w:val="6B7280"/>
+          <w:sz w:val="20"/>
+          <w:szCs w:val="20"/>
+        </w:rPr>
+        <w:t xml:space="preserve">Relecture du 21/09/2026 au passage du contrôle de note ajouté ce jour au prompt (étape 7.6 bis). Les corrections sont intégrées au texte, marquées [Corrigé le 21/09/2026 : …] ; le contenu sur la loi relative à l'aide à mourir n'a pas été relu. Formulations d'origine :</w:t>
+      </w:r>
+    </w:p>
+    <w:p>
+      <w:pPr>
+        <w:pStyle w:val="ListParagraph"/>
+        <w:numPr>
+          <w:ilvl w:val="0"/>
+          <w:numId w:val="1"/>
+        </w:numPr>
+        <w:spacing w:after="50"/>
+      </w:pPr>
+      <w:r>
+        <w:rPr>
+          <w:rFonts w:ascii="Calibri" w:cs="Calibri" w:eastAsia="Calibri" w:hAnsi="Calibri"/>
+          <w:i/>
+          <w:iCs/>
+          <w:color w:val="6B7280"/>
+          <w:sz w:val="20"/>
+          <w:szCs w:val="20"/>
+        </w:rPr>
+        <w:t xml:space="preserve">En bref : « Aucune nouvelle RBPP publiée dans la fenêtre de référence » — sans source lisible ; confirmé sur le flux RSS le 21/09/2026.</w:t>
+      </w:r>
+    </w:p>
+    <w:p>
+      <w:pPr>
+        <w:pStyle w:val="ListParagraph"/>
+        <w:numPr>
+          <w:ilvl w:val="0"/>
+          <w:numId w:val="1"/>
+        </w:numPr>
+        <w:spacing w:after="50"/>
+      </w:pPr>
+      <w:r>
+        <w:rPr>
+          <w:rFonts w:ascii="Calibri" w:cs="Calibri" w:eastAsia="Calibri" w:hAnsi="Calibri"/>
+          <w:i/>
+          <w:iCs/>
+          <w:color w:val="6B7280"/>
+          <w:sz w:val="20"/>
+          <w:szCs w:val="20"/>
+        </w:rPr>
+        <w:t xml:space="preserve">Rappel : « HAS — 22 ans d'existence (article du 13 août 2026) » — page nommée et datée sans lien ; lien ajouté.</w:t>
+      </w:r>
+    </w:p>
+    <w:p>
+      <w:pPr>
+        <w:pStyle w:val="ListParagraph"/>
+        <w:numPr>
+          <w:ilvl w:val="0"/>
+          <w:numId w:val="1"/>
+        </w:numPr>
+        <w:spacing w:after="50"/>
+      </w:pPr>
+      <w:r>
+        <w:rPr>
+          <w:rFonts w:ascii="Calibri" w:cs="Calibri" w:eastAsia="Calibri" w:hAnsi="Calibri"/>
+          <w:i/>
+          <w:iCs/>
+          <w:color w:val="6B7280"/>
+          <w:sz w:val="20"/>
+          <w:szCs w:val="20"/>
+        </w:rPr>
+        <w:t xml:space="preserve">À venir : « appel à candidatures clos le 4 septembre 2026. Sélection des experts en septembre, travaux démarrant à l'automne 2026 » — sans lien dans la phrase ; calendrier de la note de cadrage substitué.</w:t>
+      </w:r>
+    </w:p>
+    <w:p>
+      <w:pPr>
+        <w:pStyle w:val="ListParagraph"/>
+        <w:numPr>
+          <w:ilvl w:val="0"/>
+          <w:numId w:val="1"/>
+        </w:numPr>
+        <w:spacing w:after="50"/>
+      </w:pPr>
+      <w:r>
+        <w:rPr>
+          <w:rFonts w:ascii="Calibri" w:cs="Calibri" w:eastAsia="Calibri" w:hAnsi="Calibri"/>
+          <w:i/>
+          <w:iCs/>
+          <w:color w:val="6B7280"/>
+          <w:sz w:val="20"/>
+          <w:szCs w:val="20"/>
+        </w:rPr>
+        <w:t xml:space="preserve">À venir : « publication de la recommandation attendue en fin d'année » (prévention spécialisée) — projection sans source.</w:t>
+      </w:r>
+    </w:p>
+    <w:p>
+      <w:pPr>
+        <w:pStyle w:val="ListParagraph"/>
+        <w:numPr>
+          <w:ilvl w:val="0"/>
+          <w:numId w:val="1"/>
+        </w:numPr>
+        <w:spacing w:after="50"/>
+      </w:pPr>
+      <w:r>
+        <w:rPr>
+          <w:rFonts w:ascii="Calibri" w:cs="Calibri" w:eastAsia="Calibri" w:hAnsi="Calibri"/>
+          <w:i/>
+          <w:iCs/>
+          <w:color w:val="6B7280"/>
+          <w:sz w:val="20"/>
+          <w:szCs w:val="20"/>
+        </w:rPr>
+        <w:t xml:space="preserve">À venir : « RBPP Habitat — volet 3 : travaux en cours (appel candidatures clôturé en avril 2026), publication attendue » — clôture sans source, publication sans page.</w:t>
+      </w:r>
+    </w:p>
+    <w:p>
+      <w:pPr>
+        <w:pStyle w:val="ListParagraph"/>
+        <w:numPr>
+          <w:ilvl w:val="0"/>
+          <w:numId w:val="1"/>
+        </w:numPr>
+        <w:spacing w:after="50"/>
+      </w:pPr>
+      <w:r>
+        <w:rPr>
+          <w:rFonts w:ascii="Calibri" w:cs="Calibri" w:eastAsia="Calibri" w:hAnsi="Calibri"/>
+          <w:i/>
+          <w:iCs/>
+          <w:color w:val="6B7280"/>
+          <w:sz w:val="20"/>
+          <w:szCs w:val="20"/>
+        </w:rPr>
+        <w:t xml:space="preserve">Consultations : « clôture le 4 septembre 2026. Lien : has-sante.fr (voir sources) » — lien mis dans la phrase.</w:t>
+      </w:r>
+    </w:p>
+    <w:p>
+      <w:pPr>
+        <w:pStyle w:val="ListParagraph"/>
+        <w:numPr>
+          <w:ilvl w:val="0"/>
+          <w:numId w:val="1"/>
+        </w:numPr>
+        <w:spacing w:after="50"/>
+      </w:pPr>
+      <w:r>
+        <w:rPr>
+          <w:rFonts w:ascii="Calibri" w:cs="Calibri" w:eastAsia="Calibri" w:hAnsi="Calibri"/>
+          <w:i/>
+          <w:iCs/>
+          <w:color w:val="6B7280"/>
+          <w:sz w:val="20"/>
+          <w:szCs w:val="20"/>
+        </w:rPr>
+        <w:t xml:space="preserve">Impacts : « publication probable de la RBPP Prévention spécialisée » — projection sans source.</w:t>
+      </w:r>
+    </w:p>
+    <w:p>
+      <w:pPr>
+        <w:pStyle w:val="ListParagraph"/>
+        <w:numPr>
+          <w:ilvl w:val="0"/>
+          <w:numId w:val="1"/>
+        </w:numPr>
+        <w:spacing w:after="50"/>
+      </w:pPr>
+      <w:r>
+        <w:rPr>
+          <w:rFonts w:ascii="Calibri" w:cs="Calibri" w:eastAsia="Calibri" w:hAnsi="Calibri"/>
+          <w:i/>
+          <w:iCs/>
+          <w:color w:val="6B7280"/>
+          <w:sz w:val="20"/>
+          <w:szCs w:val="20"/>
+        </w:rPr>
+        <w:t xml:space="preserve">Sources : « 5 sources documentaires tentées — 4 ✅ / 1 ⚠️ » — flux RSS et article des 22 ans ajoutés à la relecture : 7 — 6 ✅ / 1 ⚠️.</w:t>
       </w:r>
     </w:p>
     <w:sectPr>

</xml_diff>